<commit_message>
RQM Complemento Logs - E4: manuales, casos de prueba y traspaso actualizados
Co-Authored-By: Claude Opus 5.5 <noreply@anthropic.com>
Claude-Session: https://claude.ai/code/session_01BJBf3VznR328nVdwrkfCSa
</commit_message>
<xml_diff>
--- a/documentos/2026-10-20 RQM Complemento de Modúlo de consulta de logs/T17 - Manual Tecnico.docx
+++ b/documentos/2026-10-20 RQM Complemento de Modúlo de consulta de logs/T17 - Manual Tecnico.docx
@@ -2833,6 +2833,107 @@
           </w:p>
         </w:tc>
       </w:tr>
+      <w:tr>
+        <w:tc>
+          <w:tcPr>
+            <w:tcW w:type="dxa" w:w="2600"/>
+            <w:tcBorders>
+              <w:top w:val="single" w:color="8EAADB" w:sz="4"/>
+              <w:left w:val="single" w:color="8EAADB" w:sz="4"/>
+              <w:bottom w:val="single" w:color="8EAADB" w:sz="4"/>
+              <w:right w:val="single" w:color="8EAADB" w:sz="4"/>
+            </w:tcBorders>
+            <w:shd w:fill="DAE9F7" w:color="auto" w:val="clear"/>
+            <w:tcMar>
+              <w:top w:type="dxa" w:w="60"/>
+              <w:left w:type="dxa" w:w="100"/>
+              <w:bottom w:type="dxa" w:w="60"/>
+              <w:right w:type="dxa" w:w="100"/>
+            </w:tcMar>
+          </w:tcPr>
+          <w:p>
+            <w:pPr>
+              <w:jc w:val="left"/>
+            </w:pPr>
+            <w:r>
+              <w:rPr>
+                <w:rFonts w:ascii="Century Gothic" w:cs="Century Gothic" w:eastAsia="Century Gothic" w:hAnsi="Century Gothic"/>
+                <w:b/>
+                <w:bCs/>
+                <w:sz w:val="18"/>
+                <w:szCs w:val="18"/>
+              </w:rPr>
+              <w:t xml:space="preserve">20 - Consecutivos de referencia interna</w:t>
+            </w:r>
+          </w:p>
+        </w:tc>
+        <w:tc>
+          <w:tcPr>
+            <w:tcW w:type="dxa" w:w="1100"/>
+            <w:tcBorders>
+              <w:top w:val="single" w:color="8EAADB" w:sz="4"/>
+              <w:left w:val="single" w:color="8EAADB" w:sz="4"/>
+              <w:bottom w:val="single" w:color="8EAADB" w:sz="4"/>
+              <w:right w:val="single" w:color="8EAADB" w:sz="4"/>
+            </w:tcBorders>
+            <w:shd w:fill="DAE9F7" w:color="auto" w:val="clear"/>
+            <w:tcMar>
+              <w:top w:type="dxa" w:w="60"/>
+              <w:left w:type="dxa" w:w="100"/>
+              <w:bottom w:type="dxa" w:w="60"/>
+              <w:right w:type="dxa" w:w="100"/>
+            </w:tcMar>
+          </w:tcPr>
+          <w:p>
+            <w:pPr>
+              <w:jc w:val="left"/>
+            </w:pPr>
+            <w:r>
+              <w:rPr>
+                <w:rFonts w:ascii="Century Gothic" w:cs="Century Gothic" w:eastAsia="Century Gothic" w:hAnsi="Century Gothic"/>
+                <w:b w:val="false"/>
+                <w:bCs w:val="false"/>
+                <w:sz w:val="18"/>
+                <w:szCs w:val="18"/>
+              </w:rPr>
+              <w:t xml:space="preserve">E4 C1</w:t>
+            </w:r>
+          </w:p>
+        </w:tc>
+        <w:tc>
+          <w:tcPr>
+            <w:tcW w:type="dxa" w:w="5660"/>
+            <w:tcBorders>
+              <w:top w:val="single" w:color="8EAADB" w:sz="4"/>
+              <w:left w:val="single" w:color="8EAADB" w:sz="4"/>
+              <w:bottom w:val="single" w:color="8EAADB" w:sz="4"/>
+              <w:right w:val="single" w:color="8EAADB" w:sz="4"/>
+            </w:tcBorders>
+            <w:shd w:fill="DAE9F7" w:color="auto" w:val="clear"/>
+            <w:tcMar>
+              <w:top w:type="dxa" w:w="60"/>
+              <w:left w:type="dxa" w:w="100"/>
+              <w:bottom w:type="dxa" w:w="60"/>
+              <w:right w:type="dxa" w:w="100"/>
+            </w:tcMar>
+          </w:tcPr>
+          <w:p>
+            <w:pPr>
+              <w:jc w:val="left"/>
+            </w:pPr>
+            <w:r>
+              <w:rPr>
+                <w:rFonts w:ascii="Century Gothic" w:cs="Century Gothic" w:eastAsia="Century Gothic" w:hAnsi="Century Gothic"/>
+                <w:b w:val="false"/>
+                <w:bCs w:val="false"/>
+                <w:sz w:val="18"/>
+                <w:szCs w:val="18"/>
+              </w:rPr>
+              <w:t xml:space="preserve">INTERNAL_REFERENCE_CODES, INTERNAL_REFERENCE_CONSECUTIVES, FN_INTERNAL_REFERENCE_USED_CONSECUTIVES, SP de consulta y de generación (transacción con bloqueo por código).</w:t>
+            </w:r>
+          </w:p>
+        </w:tc>
+      </w:tr>
     </w:tbl>
     <w:p>
       <w:pPr>
@@ -2928,7 +3029,7 @@
           <w:sz w:val="20"/>
           <w:szCs w:val="20"/>
         </w:rPr>
-        <w:t xml:space="preserve">: 04, 05, 14, 15, 16, 17, 18 y 19. Antes de ejecutar una reversa se publica la versión de la aplicación sin la funcionalidad correspondiente.</w:t>
+        <w:t xml:space="preserve">: 04, 05, 14, 15, 16, 17, 18, 19 y 20. Antes de ejecutar una reversa se publica la versión de la aplicación sin la funcionalidad correspondiente.</w:t>
       </w:r>
     </w:p>
     <w:p>
@@ -5116,6 +5217,453 @@
     </w:tbl>
     <w:p>
       <w:pPr>
+        <w:pStyle w:val="Heading2"/>
+        <w:spacing w:after="100" w:before="240"/>
+      </w:pPr>
+      <w:r>
+        <w:rPr>
+          <w:rFonts w:ascii="Century Gothic" w:cs="Century Gothic" w:eastAsia="Century Gothic" w:hAnsi="Century Gothic"/>
+          <w:b/>
+          <w:bCs/>
+          <w:color w:val="0F4761"/>
+          <w:sz w:val="24"/>
+          <w:szCs w:val="24"/>
+        </w:rPr>
+        <w:t xml:space="preserve">Consecutivos de referencia interna (E4)</w:t>
+      </w:r>
+    </w:p>
+    <w:tbl>
+      <w:tblPr>
+        <w:tblW w:type="dxa" w:w="9360"/>
+        <w:tblBorders>
+          <w:top w:val="single" w:color="auto" w:sz="4"/>
+          <w:left w:val="single" w:color="auto" w:sz="4"/>
+          <w:bottom w:val="single" w:color="auto" w:sz="4"/>
+          <w:right w:val="single" w:color="auto" w:sz="4"/>
+          <w:insideH w:val="single" w:color="auto" w:sz="4"/>
+          <w:insideV w:val="single" w:color="auto" w:sz="4"/>
+        </w:tblBorders>
+      </w:tblPr>
+      <w:tblGrid>
+        <w:gridCol w:w="1600"/>
+        <w:gridCol w:w="7760"/>
+      </w:tblGrid>
+      <w:tr>
+        <w:trPr>
+          <w:tblHeader/>
+        </w:trPr>
+        <w:tc>
+          <w:tcPr>
+            <w:tcW w:type="dxa" w:w="1600"/>
+            <w:tcBorders>
+              <w:top w:val="single" w:color="8EAADB" w:sz="4"/>
+              <w:left w:val="single" w:color="8EAADB" w:sz="4"/>
+              <w:bottom w:val="single" w:color="8EAADB" w:sz="4"/>
+              <w:right w:val="single" w:color="8EAADB" w:sz="4"/>
+            </w:tcBorders>
+            <w:shd w:fill="0F4761" w:color="auto" w:val="clear"/>
+            <w:tcMar>
+              <w:top w:type="dxa" w:w="60"/>
+              <w:left w:type="dxa" w:w="100"/>
+              <w:bottom w:type="dxa" w:w="60"/>
+              <w:right w:type="dxa" w:w="100"/>
+            </w:tcMar>
+          </w:tcPr>
+          <w:p>
+            <w:pPr>
+              <w:jc w:val="center"/>
+            </w:pPr>
+            <w:r>
+              <w:rPr>
+                <w:rFonts w:ascii="Century Gothic" w:cs="Century Gothic" w:eastAsia="Century Gothic" w:hAnsi="Century Gothic"/>
+                <w:b/>
+                <w:bCs/>
+                <w:color w:val="FFFFFF"/>
+                <w:sz w:val="18"/>
+                <w:szCs w:val="18"/>
+              </w:rPr>
+              <w:t xml:space="preserve">Capa</w:t>
+            </w:r>
+          </w:p>
+        </w:tc>
+        <w:tc>
+          <w:tcPr>
+            <w:tcW w:type="dxa" w:w="7760"/>
+            <w:tcBorders>
+              <w:top w:val="single" w:color="8EAADB" w:sz="4"/>
+              <w:left w:val="single" w:color="8EAADB" w:sz="4"/>
+              <w:bottom w:val="single" w:color="8EAADB" w:sz="4"/>
+              <w:right w:val="single" w:color="8EAADB" w:sz="4"/>
+            </w:tcBorders>
+            <w:shd w:fill="0F4761" w:color="auto" w:val="clear"/>
+            <w:tcMar>
+              <w:top w:type="dxa" w:w="60"/>
+              <w:left w:type="dxa" w:w="100"/>
+              <w:bottom w:type="dxa" w:w="60"/>
+              <w:right w:type="dxa" w:w="100"/>
+            </w:tcMar>
+          </w:tcPr>
+          <w:p>
+            <w:pPr>
+              <w:jc w:val="center"/>
+            </w:pPr>
+            <w:r>
+              <w:rPr>
+                <w:rFonts w:ascii="Century Gothic" w:cs="Century Gothic" w:eastAsia="Century Gothic" w:hAnsi="Century Gothic"/>
+                <w:b/>
+                <w:bCs/>
+                <w:color w:val="FFFFFF"/>
+                <w:sz w:val="18"/>
+                <w:szCs w:val="18"/>
+              </w:rPr>
+              <w:t xml:space="preserve">Componentes</w:t>
+            </w:r>
+          </w:p>
+        </w:tc>
+      </w:tr>
+      <w:tr>
+        <w:tc>
+          <w:tcPr>
+            <w:tcW w:type="dxa" w:w="1600"/>
+            <w:tcBorders>
+              <w:top w:val="single" w:color="8EAADB" w:sz="4"/>
+              <w:left w:val="single" w:color="8EAADB" w:sz="4"/>
+              <w:bottom w:val="single" w:color="8EAADB" w:sz="4"/>
+              <w:right w:val="single" w:color="8EAADB" w:sz="4"/>
+            </w:tcBorders>
+            <w:shd w:fill="FFFFFF" w:color="auto" w:val="clear"/>
+            <w:tcMar>
+              <w:top w:type="dxa" w:w="60"/>
+              <w:left w:type="dxa" w:w="100"/>
+              <w:bottom w:type="dxa" w:w="60"/>
+              <w:right w:type="dxa" w:w="100"/>
+            </w:tcMar>
+          </w:tcPr>
+          <w:p>
+            <w:pPr>
+              <w:jc w:val="left"/>
+            </w:pPr>
+            <w:r>
+              <w:rPr>
+                <w:rFonts w:ascii="Century Gothic" w:cs="Century Gothic" w:eastAsia="Century Gothic" w:hAnsi="Century Gothic"/>
+                <w:b/>
+                <w:bCs/>
+                <w:sz w:val="18"/>
+                <w:szCs w:val="18"/>
+              </w:rPr>
+              <w:t xml:space="preserve">BD</w:t>
+            </w:r>
+          </w:p>
+        </w:tc>
+        <w:tc>
+          <w:tcPr>
+            <w:tcW w:type="dxa" w:w="7760"/>
+            <w:tcBorders>
+              <w:top w:val="single" w:color="8EAADB" w:sz="4"/>
+              <w:left w:val="single" w:color="8EAADB" w:sz="4"/>
+              <w:bottom w:val="single" w:color="8EAADB" w:sz="4"/>
+              <w:right w:val="single" w:color="8EAADB" w:sz="4"/>
+            </w:tcBorders>
+            <w:shd w:fill="FFFFFF" w:color="auto" w:val="clear"/>
+            <w:tcMar>
+              <w:top w:type="dxa" w:w="60"/>
+              <w:left w:type="dxa" w:w="100"/>
+              <w:bottom w:type="dxa" w:w="60"/>
+              <w:right w:type="dxa" w:w="100"/>
+            </w:tcMar>
+          </w:tcPr>
+          <w:p>
+            <w:pPr>
+              <w:jc w:val="left"/>
+            </w:pPr>
+            <w:r>
+              <w:rPr>
+                <w:rFonts w:ascii="Century Gothic" w:cs="Century Gothic" w:eastAsia="Century Gothic" w:hAnsi="Century Gothic"/>
+                <w:b w:val="false"/>
+                <w:bCs w:val="false"/>
+                <w:sz w:val="18"/>
+                <w:szCs w:val="18"/>
+              </w:rPr>
+              <w:t xml:space="preserve">FN_INTERNAL_REFERENCE_USED_CONSECUTIVES compara por posición (LEFT/SUBSTRING, sin LIKE sobre el código) para que '_', '%' o '[' no actúen como comodines. SP_GENERATE_INTERNAL_REFERENCE_CONSECUTIVES bloquea el código (UPDLOCK, HOLDLOCK) dentro de la transacción: generaciones concurrentes del mismo código se serializan.</w:t>
+            </w:r>
+          </w:p>
+        </w:tc>
+      </w:tr>
+      <w:tr>
+        <w:tc>
+          <w:tcPr>
+            <w:tcW w:type="dxa" w:w="1600"/>
+            <w:tcBorders>
+              <w:top w:val="single" w:color="8EAADB" w:sz="4"/>
+              <w:left w:val="single" w:color="8EAADB" w:sz="4"/>
+              <w:bottom w:val="single" w:color="8EAADB" w:sz="4"/>
+              <w:right w:val="single" w:color="8EAADB" w:sz="4"/>
+            </w:tcBorders>
+            <w:shd w:fill="DAE9F7" w:color="auto" w:val="clear"/>
+            <w:tcMar>
+              <w:top w:type="dxa" w:w="60"/>
+              <w:left w:type="dxa" w:w="100"/>
+              <w:bottom w:type="dxa" w:w="60"/>
+              <w:right w:type="dxa" w:w="100"/>
+            </w:tcMar>
+          </w:tcPr>
+          <w:p>
+            <w:pPr>
+              <w:jc w:val="left"/>
+            </w:pPr>
+            <w:r>
+              <w:rPr>
+                <w:rFonts w:ascii="Century Gothic" w:cs="Century Gothic" w:eastAsia="Century Gothic" w:hAnsi="Century Gothic"/>
+                <w:b/>
+                <w:bCs/>
+                <w:sz w:val="18"/>
+                <w:szCs w:val="18"/>
+              </w:rPr>
+              <w:t xml:space="preserve">DataAccess</w:t>
+            </w:r>
+          </w:p>
+        </w:tc>
+        <w:tc>
+          <w:tcPr>
+            <w:tcW w:type="dxa" w:w="7760"/>
+            <w:tcBorders>
+              <w:top w:val="single" w:color="8EAADB" w:sz="4"/>
+              <w:left w:val="single" w:color="8EAADB" w:sz="4"/>
+              <w:bottom w:val="single" w:color="8EAADB" w:sz="4"/>
+              <w:right w:val="single" w:color="8EAADB" w:sz="4"/>
+            </w:tcBorders>
+            <w:shd w:fill="DAE9F7" w:color="auto" w:val="clear"/>
+            <w:tcMar>
+              <w:top w:type="dxa" w:w="60"/>
+              <w:left w:type="dxa" w:w="100"/>
+              <w:bottom w:type="dxa" w:w="60"/>
+              <w:right w:type="dxa" w:w="100"/>
+            </w:tcMar>
+          </w:tcPr>
+          <w:p>
+            <w:pPr>
+              <w:jc w:val="left"/>
+            </w:pPr>
+            <w:r>
+              <w:rPr>
+                <w:rFonts w:ascii="Century Gothic" w:cs="Century Gothic" w:eastAsia="Century Gothic" w:hAnsi="Century Gothic"/>
+                <w:b w:val="false"/>
+                <w:bCs w:val="false"/>
+                <w:sz w:val="18"/>
+                <w:szCs w:val="18"/>
+              </w:rPr>
+              <w:t xml:space="preserve">InternalReferenceConsecutiveEntry (keyless) e InternalReferenceConsecutiveRepository (StoredProcedureCommand).</w:t>
+            </w:r>
+          </w:p>
+        </w:tc>
+      </w:tr>
+      <w:tr>
+        <w:tc>
+          <w:tcPr>
+            <w:tcW w:type="dxa" w:w="1600"/>
+            <w:tcBorders>
+              <w:top w:val="single" w:color="8EAADB" w:sz="4"/>
+              <w:left w:val="single" w:color="8EAADB" w:sz="4"/>
+              <w:bottom w:val="single" w:color="8EAADB" w:sz="4"/>
+              <w:right w:val="single" w:color="8EAADB" w:sz="4"/>
+            </w:tcBorders>
+            <w:shd w:fill="FFFFFF" w:color="auto" w:val="clear"/>
+            <w:tcMar>
+              <w:top w:type="dxa" w:w="60"/>
+              <w:left w:type="dxa" w:w="100"/>
+              <w:bottom w:type="dxa" w:w="60"/>
+              <w:right w:type="dxa" w:w="100"/>
+            </w:tcMar>
+          </w:tcPr>
+          <w:p>
+            <w:pPr>
+              <w:jc w:val="left"/>
+            </w:pPr>
+            <w:r>
+              <w:rPr>
+                <w:rFonts w:ascii="Century Gothic" w:cs="Century Gothic" w:eastAsia="Century Gothic" w:hAnsi="Century Gothic"/>
+                <w:b/>
+                <w:bCs/>
+                <w:sz w:val="18"/>
+                <w:szCs w:val="18"/>
+              </w:rPr>
+              <w:t xml:space="preserve">Application</w:t>
+            </w:r>
+          </w:p>
+        </w:tc>
+        <w:tc>
+          <w:tcPr>
+            <w:tcW w:type="dxa" w:w="7760"/>
+            <w:tcBorders>
+              <w:top w:val="single" w:color="8EAADB" w:sz="4"/>
+              <w:left w:val="single" w:color="8EAADB" w:sz="4"/>
+              <w:bottom w:val="single" w:color="8EAADB" w:sz="4"/>
+              <w:right w:val="single" w:color="8EAADB" w:sz="4"/>
+            </w:tcBorders>
+            <w:shd w:fill="FFFFFF" w:color="auto" w:val="clear"/>
+            <w:tcMar>
+              <w:top w:type="dxa" w:w="60"/>
+              <w:left w:type="dxa" w:w="100"/>
+              <w:bottom w:type="dxa" w:w="60"/>
+              <w:right w:type="dxa" w:w="100"/>
+            </w:tcMar>
+          </w:tcPr>
+          <w:p>
+            <w:pPr>
+              <w:jc w:val="left"/>
+            </w:pPr>
+            <w:r>
+              <w:rPr>
+                <w:rFonts w:ascii="Century Gothic" w:cs="Century Gothic" w:eastAsia="Century Gothic" w:hAnsi="Century Gothic"/>
+                <w:b w:val="false"/>
+                <w:bCs w:val="false"/>
+                <w:sz w:val="18"/>
+                <w:szCs w:val="18"/>
+              </w:rPr>
+              <w:t xml:space="preserve">InternalReferenceConsecutiveService, InternalReferenceCodeRules (máx. 6 caracteres: CÓDIGO-NNN debe caber en items.INTERNAL_REFERENCE varchar(10)).</w:t>
+            </w:r>
+          </w:p>
+        </w:tc>
+      </w:tr>
+      <w:tr>
+        <w:tc>
+          <w:tcPr>
+            <w:tcW w:type="dxa" w:w="1600"/>
+            <w:tcBorders>
+              <w:top w:val="single" w:color="8EAADB" w:sz="4"/>
+              <w:left w:val="single" w:color="8EAADB" w:sz="4"/>
+              <w:bottom w:val="single" w:color="8EAADB" w:sz="4"/>
+              <w:right w:val="single" w:color="8EAADB" w:sz="4"/>
+            </w:tcBorders>
+            <w:shd w:fill="DAE9F7" w:color="auto" w:val="clear"/>
+            <w:tcMar>
+              <w:top w:type="dxa" w:w="60"/>
+              <w:left w:type="dxa" w:w="100"/>
+              <w:bottom w:type="dxa" w:w="60"/>
+              <w:right w:type="dxa" w:w="100"/>
+            </w:tcMar>
+          </w:tcPr>
+          <w:p>
+            <w:pPr>
+              <w:jc w:val="left"/>
+            </w:pPr>
+            <w:r>
+              <w:rPr>
+                <w:rFonts w:ascii="Century Gothic" w:cs="Century Gothic" w:eastAsia="Century Gothic" w:hAnsi="Century Gothic"/>
+                <w:b/>
+                <w:bCs/>
+                <w:sz w:val="18"/>
+                <w:szCs w:val="18"/>
+              </w:rPr>
+              <w:t xml:space="preserve">Web</w:t>
+            </w:r>
+          </w:p>
+        </w:tc>
+        <w:tc>
+          <w:tcPr>
+            <w:tcW w:type="dxa" w:w="7760"/>
+            <w:tcBorders>
+              <w:top w:val="single" w:color="8EAADB" w:sz="4"/>
+              <w:left w:val="single" w:color="8EAADB" w:sz="4"/>
+              <w:bottom w:val="single" w:color="8EAADB" w:sz="4"/>
+              <w:right w:val="single" w:color="8EAADB" w:sz="4"/>
+            </w:tcBorders>
+            <w:shd w:fill="DAE9F7" w:color="auto" w:val="clear"/>
+            <w:tcMar>
+              <w:top w:type="dxa" w:w="60"/>
+              <w:left w:type="dxa" w:w="100"/>
+              <w:bottom w:type="dxa" w:w="60"/>
+              <w:right w:type="dxa" w:w="100"/>
+            </w:tcMar>
+          </w:tcPr>
+          <w:p>
+            <w:pPr>
+              <w:jc w:val="left"/>
+            </w:pPr>
+            <w:r>
+              <w:rPr>
+                <w:rFonts w:ascii="Century Gothic" w:cs="Century Gothic" w:eastAsia="Century Gothic" w:hAnsi="Century Gothic"/>
+                <w:b w:val="false"/>
+                <w:bCs w:val="false"/>
+                <w:sz w:val="18"/>
+                <w:szCs w:val="18"/>
+              </w:rPr>
+              <w:t xml:space="preserve">Pages/ItemPages/InternalReferenceConsecutives (/internal-reference-consecutives), menú Administración.</w:t>
+            </w:r>
+          </w:p>
+        </w:tc>
+      </w:tr>
+      <w:tr>
+        <w:tc>
+          <w:tcPr>
+            <w:tcW w:type="dxa" w:w="1600"/>
+            <w:tcBorders>
+              <w:top w:val="single" w:color="8EAADB" w:sz="4"/>
+              <w:left w:val="single" w:color="8EAADB" w:sz="4"/>
+              <w:bottom w:val="single" w:color="8EAADB" w:sz="4"/>
+              <w:right w:val="single" w:color="8EAADB" w:sz="4"/>
+            </w:tcBorders>
+            <w:shd w:fill="FFFFFF" w:color="auto" w:val="clear"/>
+            <w:tcMar>
+              <w:top w:type="dxa" w:w="60"/>
+              <w:left w:type="dxa" w:w="100"/>
+              <w:bottom w:type="dxa" w:w="60"/>
+              <w:right w:type="dxa" w:w="100"/>
+            </w:tcMar>
+          </w:tcPr>
+          <w:p>
+            <w:pPr>
+              <w:jc w:val="left"/>
+            </w:pPr>
+            <w:r>
+              <w:rPr>
+                <w:rFonts w:ascii="Century Gothic" w:cs="Century Gothic" w:eastAsia="Century Gothic" w:hAnsi="Century Gothic"/>
+                <w:b/>
+                <w:bCs/>
+                <w:sz w:val="18"/>
+                <w:szCs w:val="18"/>
+              </w:rPr>
+              <w:t xml:space="preserve">Pruebas</w:t>
+            </w:r>
+          </w:p>
+        </w:tc>
+        <w:tc>
+          <w:tcPr>
+            <w:tcW w:type="dxa" w:w="7760"/>
+            <w:tcBorders>
+              <w:top w:val="single" w:color="8EAADB" w:sz="4"/>
+              <w:left w:val="single" w:color="8EAADB" w:sz="4"/>
+              <w:bottom w:val="single" w:color="8EAADB" w:sz="4"/>
+              <w:right w:val="single" w:color="8EAADB" w:sz="4"/>
+            </w:tcBorders>
+            <w:shd w:fill="FFFFFF" w:color="auto" w:val="clear"/>
+            <w:tcMar>
+              <w:top w:type="dxa" w:w="60"/>
+              <w:left w:type="dxa" w:w="100"/>
+              <w:bottom w:type="dxa" w:w="60"/>
+              <w:right w:type="dxa" w:w="100"/>
+            </w:tcMar>
+          </w:tcPr>
+          <w:p>
+            <w:pPr>
+              <w:jc w:val="left"/>
+            </w:pPr>
+            <w:r>
+              <w:rPr>
+                <w:rFonts w:ascii="Century Gothic" w:cs="Century Gothic" w:eastAsia="Century Gothic" w:hAnsi="Century Gothic"/>
+                <w:b w:val="false"/>
+                <w:bCs w:val="false"/>
+                <w:sz w:val="18"/>
+                <w:szCs w:val="18"/>
+              </w:rPr>
+              <w:t xml:space="preserve">Proyecto Aldebaran.Application.Services.Tests (xUnit): reglas y servicio. Ejecutar con dotnet test.</w:t>
+            </w:r>
+          </w:p>
+        </w:tc>
+      </w:tr>
+    </w:tbl>
+    <w:p>
+      <w:pPr>
         <w:pStyle w:val="Heading1"/>
         <w:spacing w:after="120" w:before="360"/>
       </w:pPr>
@@ -5293,7 +5841,7 @@
           <w:sz w:val="20"/>
           <w:szCs w:val="20"/>
         </w:rPr>
-        <w:t xml:space="preserve"> en orden (01–19) sobre la BD Aldebaran. Los scripts 16, 18 y 19 se ejecutan en la misma ventana en que se publica la aplicación.</w:t>
+        <w:t xml:space="preserve"> en orden (01–20) sobre la BD Aldebaran. Los scripts 16, 18 y 19 se ejecutan en la misma ventana en que se publica la aplicación.</w:t>
       </w:r>
     </w:p>
     <w:p>
@@ -5423,7 +5971,7 @@
           <w:sz w:val="20"/>
           <w:szCs w:val="20"/>
         </w:rPr>
-        <w:t xml:space="preserve">Publicar la versión anterior de la aplicación y ejecutar las reversas en orden inverso (19, 18, 17, 16, 15, 14, 05, 04). Las tablas de log se conservan.</w:t>
+        <w:t xml:space="preserve">Publicar la versión anterior de la aplicación y ejecutar las reversas en orden inverso (20, 19, 18, 17, 16, 15, 14, 05, 04). Las tablas de log se conservan.</w:t>
       </w:r>
     </w:p>
     <w:p>

</xml_diff>

<commit_message>
RQM Complemento Logs - E4: Consecutivos solo disponibles y Generar completa hasta N
- Script 20 (+ reversa): INTERNAL_REFERENCE_CONSECUTIVES guarda solo los disponibles; nuevo
  SP_PURGE_USED_INTERNAL_REFERENCE_CONSECUTIVES elimina los que ya son referencia interna de un artículo
  (se ejecuta al Consultar y al Generar). Generar completa hasta @Quantity disponibles: crea
  @Quantity - disponibles a partir del mayor entre disponibles y usados + 1; si ya hay suficientes no crea.
  Ambos SP devuelven los disponibles con IsNew.
- Entidad, modelo y servicio con IsNew; pantalla: "Cantidad requerida", columna "Generado ahora" y
  mensaje cuando no fue necesario generar.
- Pruebas unitarias, Plan de trabajo, manuales (usuario y técnico) y casos de prueba E4 actualizados.

Co-Authored-By: Claude Opus 5.5 <noreply@anthropic.com>
Claude-Session: https://claude.ai/code/session_01BJBf3VznR328nVdwrkfCSa
</commit_message>
<xml_diff>
--- a/documentos/2026-10-20 RQM Complemento de Modúlo de consulta de logs/T17 - Manual Tecnico.docx
+++ b/documentos/2026-10-20 RQM Complemento de Modúlo de consulta de logs/T17 - Manual Tecnico.docx
@@ -2929,7 +2929,7 @@
                 <w:sz w:val="18"/>
                 <w:szCs w:val="18"/>
               </w:rPr>
-              <w:t xml:space="preserve">INTERNAL_REFERENCE_CODES, INTERNAL_REFERENCE_CONSECUTIVES, FN_INTERNAL_REFERENCE_USED_CONSECUTIVES, SP de consulta y de generación (transacción con bloqueo por código).</w:t>
+              <w:t xml:space="preserve">INTERNAL_REFERENCE_CODES, INTERNAL_REFERENCE_CONSECUTIVES (solo disponibles), FN_INTERNAL_REFERENCE_USED_CONSECUTIVES, SP_PURGE_USED_..., SP de consulta y de generación (transacción con bloqueo por código).</w:t>
             </w:r>
           </w:p>
         </w:tc>
@@ -5384,7 +5384,7 @@
                 <w:sz w:val="18"/>
                 <w:szCs w:val="18"/>
               </w:rPr>
-              <w:t xml:space="preserve">FN_INTERNAL_REFERENCE_USED_CONSECUTIVES compara por posición (LEFT/SUBSTRING, sin LIKE sobre el código) para que '_', '%' o '[' no actúen como comodines. SP_GENERATE_INTERNAL_REFERENCE_CONSECUTIVES bloquea el código (UPDLOCK, HOLDLOCK) dentro de la transacción: generaciones concurrentes del mismo código se serializan.</w:t>
+              <w:t xml:space="preserve">FN_INTERNAL_REFERENCE_USED_CONSECUTIVES compara por posición (LEFT/SUBSTRING, sin LIKE sobre el código) para que '_', '%' o '[' no actúen como comodines. INTERNAL_REFERENCE_CONSECUTIVES conserva solo disponibles: SP_PURGE_USED_INTERNAL_REFERENCE_CONSECUTIVES elimina los usados en items al Consultar y al Generar (la tabla no crece como items). SP_GENERATE_INTERNAL_REFERENCE_CONSECUTIVES completa hasta @Quantity disponibles (crea @Quantity − disponibles a partir del mayor entre disponibles y usados + 1), devuelve todos los disponibles con IsNew, y bloquea el código (UPDLOCK, HOLDLOCK): generaciones concurrentes se serializan.</w:t>
             </w:r>
           </w:p>
         </w:tc>

</xml_diff>

<commit_message>
RQM Complemento Logs - Manuales por los 4 requerimientos en una sola entrega, con pantallas
Co-Authored-By: Claude Opus 5.5 <noreply@anthropic.com>
Claude-Session: https://claude.ai/code/session_01BJBf3VznR328nVdwrkfCSa
</commit_message>
<xml_diff>
--- a/documentos/2026-10-20 RQM Complemento de Modúlo de consulta de logs/T17 - Manual Tecnico.docx
+++ b/documentos/2026-10-20 RQM Complemento de Modúlo de consulta de logs/T17 - Manual Tecnico.docx
@@ -98,7 +98,7 @@
           <w:sz w:val="30"/>
           <w:szCs w:val="30"/>
         </w:rPr>
-        <w:t xml:space="preserve">Complemento Módulo de Consulta de Logs,</w:t>
+        <w:t xml:space="preserve">Complemento Consulta de Logs, Marca $ BOMBA,</w:t>
       </w:r>
     </w:p>
     <w:p>
@@ -113,7 +113,7 @@
           <w:sz w:val="30"/>
           <w:szCs w:val="30"/>
         </w:rPr>
-        <w:t xml:space="preserve">Precio Bomba y Pedido Especial</w:t>
+        <w:t xml:space="preserve">Pedido Especial y Generador de Consecutivos</w:t>
       </w:r>
     </w:p>
     <w:p>
@@ -229,7 +229,7 @@
           <w:sz w:val="20"/>
           <w:szCs w:val="20"/>
         </w:rPr>
-        <w:t xml:space="preserve">Documenta la solución técnica del requerimiento </w:t>
+        <w:t xml:space="preserve">Documenta la solución técnica del requerimiento (rama </w:t>
       </w:r>
       <w:r>
         <w:rPr>
@@ -239,7 +239,7 @@
           <w:sz w:val="20"/>
           <w:szCs w:val="20"/>
         </w:rPr>
-        <w:t xml:space="preserve">Complemento del módulo de Consulta de Logs y Marca de Oferta</w:t>
+        <w:t xml:space="preserve">RQM-ComplementoLogs+SaleOff</w:t>
       </w:r>
       <w:r>
         <w:rPr>
@@ -247,7 +247,7 @@
           <w:sz w:val="20"/>
           <w:szCs w:val="20"/>
         </w:rPr>
-        <w:t xml:space="preserve"> (rama </w:t>
+        <w:t xml:space="preserve">), que se publica en </w:t>
       </w:r>
       <w:r>
         <w:rPr>
@@ -257,7 +257,7 @@
           <w:sz w:val="20"/>
           <w:szCs w:val="20"/>
         </w:rPr>
-        <w:t xml:space="preserve">RQM-ComplementoLogs+SaleOff</w:t>
+        <w:t xml:space="preserve">una sola entrega</w:t>
       </w:r>
       <w:r>
         <w:rPr>
@@ -265,7 +265,549 @@
           <w:sz w:val="20"/>
           <w:szCs w:val="20"/>
         </w:rPr>
-        <w:t xml:space="preserve">): objetos de base de datos, componentes por capa, seguridad, despliegue, reversa y soporte.</w:t>
+        <w:t xml:space="preserve"> con cuatro requerimientos:</w:t>
+      </w:r>
+    </w:p>
+    <w:tbl>
+      <w:tblPr>
+        <w:tblW w:type="dxa" w:w="9360"/>
+        <w:tblBorders>
+          <w:top w:val="single" w:color="auto" w:sz="4"/>
+          <w:left w:val="single" w:color="auto" w:sz="4"/>
+          <w:bottom w:val="single" w:color="auto" w:sz="4"/>
+          <w:right w:val="single" w:color="auto" w:sz="4"/>
+          <w:insideH w:val="single" w:color="auto" w:sz="4"/>
+          <w:insideV w:val="single" w:color="auto" w:sz="4"/>
+        </w:tblBorders>
+      </w:tblPr>
+      <w:tblGrid>
+        <w:gridCol w:w="2400"/>
+        <w:gridCol w:w="5560"/>
+        <w:gridCol w:w="1400"/>
+      </w:tblGrid>
+      <w:tr>
+        <w:trPr>
+          <w:tblHeader/>
+        </w:trPr>
+        <w:tc>
+          <w:tcPr>
+            <w:tcW w:type="dxa" w:w="2400"/>
+            <w:tcBorders>
+              <w:top w:val="single" w:color="8EAADB" w:sz="4"/>
+              <w:left w:val="single" w:color="8EAADB" w:sz="4"/>
+              <w:bottom w:val="single" w:color="8EAADB" w:sz="4"/>
+              <w:right w:val="single" w:color="8EAADB" w:sz="4"/>
+            </w:tcBorders>
+            <w:shd w:fill="0F4761" w:color="auto" w:val="clear"/>
+            <w:tcMar>
+              <w:top w:type="dxa" w:w="60"/>
+              <w:left w:type="dxa" w:w="100"/>
+              <w:bottom w:type="dxa" w:w="60"/>
+              <w:right w:type="dxa" w:w="100"/>
+            </w:tcMar>
+          </w:tcPr>
+          <w:p>
+            <w:pPr>
+              <w:jc w:val="center"/>
+            </w:pPr>
+            <w:r>
+              <w:rPr>
+                <w:rFonts w:ascii="Century Gothic" w:cs="Century Gothic" w:eastAsia="Century Gothic" w:hAnsi="Century Gothic"/>
+                <w:b/>
+                <w:bCs/>
+                <w:color w:val="FFFFFF"/>
+                <w:sz w:val="18"/>
+                <w:szCs w:val="18"/>
+              </w:rPr>
+              <w:t xml:space="preserve">Requerimiento</w:t>
+            </w:r>
+          </w:p>
+        </w:tc>
+        <w:tc>
+          <w:tcPr>
+            <w:tcW w:type="dxa" w:w="5560"/>
+            <w:tcBorders>
+              <w:top w:val="single" w:color="8EAADB" w:sz="4"/>
+              <w:left w:val="single" w:color="8EAADB" w:sz="4"/>
+              <w:bottom w:val="single" w:color="8EAADB" w:sz="4"/>
+              <w:right w:val="single" w:color="8EAADB" w:sz="4"/>
+            </w:tcBorders>
+            <w:shd w:fill="0F4761" w:color="auto" w:val="clear"/>
+            <w:tcMar>
+              <w:top w:type="dxa" w:w="60"/>
+              <w:left w:type="dxa" w:w="100"/>
+              <w:bottom w:type="dxa" w:w="60"/>
+              <w:right w:type="dxa" w:w="100"/>
+            </w:tcMar>
+          </w:tcPr>
+          <w:p>
+            <w:pPr>
+              <w:jc w:val="center"/>
+            </w:pPr>
+            <w:r>
+              <w:rPr>
+                <w:rFonts w:ascii="Century Gothic" w:cs="Century Gothic" w:eastAsia="Century Gothic" w:hAnsi="Century Gothic"/>
+                <w:b/>
+                <w:bCs/>
+                <w:color w:val="FFFFFF"/>
+                <w:sz w:val="18"/>
+                <w:szCs w:val="18"/>
+              </w:rPr>
+              <w:t xml:space="preserve">Contenido técnico</w:t>
+            </w:r>
+          </w:p>
+        </w:tc>
+        <w:tc>
+          <w:tcPr>
+            <w:tcW w:type="dxa" w:w="1400"/>
+            <w:tcBorders>
+              <w:top w:val="single" w:color="8EAADB" w:sz="4"/>
+              <w:left w:val="single" w:color="8EAADB" w:sz="4"/>
+              <w:bottom w:val="single" w:color="8EAADB" w:sz="4"/>
+              <w:right w:val="single" w:color="8EAADB" w:sz="4"/>
+            </w:tcBorders>
+            <w:shd w:fill="0F4761" w:color="auto" w:val="clear"/>
+            <w:tcMar>
+              <w:top w:type="dxa" w:w="60"/>
+              <w:left w:type="dxa" w:w="100"/>
+              <w:bottom w:type="dxa" w:w="60"/>
+              <w:right w:type="dxa" w:w="100"/>
+            </w:tcMar>
+          </w:tcPr>
+          <w:p>
+            <w:pPr>
+              <w:jc w:val="center"/>
+            </w:pPr>
+            <w:r>
+              <w:rPr>
+                <w:rFonts w:ascii="Century Gothic" w:cs="Century Gothic" w:eastAsia="Century Gothic" w:hAnsi="Century Gothic"/>
+                <w:b/>
+                <w:bCs/>
+                <w:color w:val="FFFFFF"/>
+                <w:sz w:val="18"/>
+                <w:szCs w:val="18"/>
+              </w:rPr>
+              <w:t xml:space="preserve">Scripts</w:t>
+            </w:r>
+          </w:p>
+        </w:tc>
+      </w:tr>
+      <w:tr>
+        <w:tc>
+          <w:tcPr>
+            <w:tcW w:type="dxa" w:w="2400"/>
+            <w:tcBorders>
+              <w:top w:val="single" w:color="8EAADB" w:sz="4"/>
+              <w:left w:val="single" w:color="8EAADB" w:sz="4"/>
+              <w:bottom w:val="single" w:color="8EAADB" w:sz="4"/>
+              <w:right w:val="single" w:color="8EAADB" w:sz="4"/>
+            </w:tcBorders>
+            <w:shd w:fill="FFFFFF" w:color="auto" w:val="clear"/>
+            <w:tcMar>
+              <w:top w:type="dxa" w:w="60"/>
+              <w:left w:type="dxa" w:w="100"/>
+              <w:bottom w:type="dxa" w:w="60"/>
+              <w:right w:type="dxa" w:w="100"/>
+            </w:tcMar>
+          </w:tcPr>
+          <w:p>
+            <w:pPr>
+              <w:jc w:val="left"/>
+            </w:pPr>
+            <w:r>
+              <w:rPr>
+                <w:rFonts w:ascii="Century Gothic" w:cs="Century Gothic" w:eastAsia="Century Gothic" w:hAnsi="Century Gothic"/>
+                <w:b/>
+                <w:bCs/>
+                <w:sz w:val="18"/>
+                <w:szCs w:val="18"/>
+              </w:rPr>
+              <w:t xml:space="preserve">1. Logs</w:t>
+            </w:r>
+          </w:p>
+        </w:tc>
+        <w:tc>
+          <w:tcPr>
+            <w:tcW w:type="dxa" w:w="5560"/>
+            <w:tcBorders>
+              <w:top w:val="single" w:color="8EAADB" w:sz="4"/>
+              <w:left w:val="single" w:color="8EAADB" w:sz="4"/>
+              <w:bottom w:val="single" w:color="8EAADB" w:sz="4"/>
+              <w:right w:val="single" w:color="8EAADB" w:sz="4"/>
+            </w:tcBorders>
+            <w:shd w:fill="FFFFFF" w:color="auto" w:val="clear"/>
+            <w:tcMar>
+              <w:top w:type="dxa" w:w="60"/>
+              <w:left w:type="dxa" w:w="100"/>
+              <w:bottom w:type="dxa" w:w="60"/>
+              <w:right w:type="dxa" w:w="100"/>
+            </w:tcMar>
+          </w:tcPr>
+          <w:p>
+            <w:pPr>
+              <w:jc w:val="left"/>
+            </w:pPr>
+            <w:r>
+              <w:rPr>
+                <w:rFonts w:ascii="Century Gothic" w:cs="Century Gothic" w:eastAsia="Century Gothic" w:hAnsi="Century Gothic"/>
+                <w:b w:val="false"/>
+                <w:bCs w:val="false"/>
+                <w:sz w:val="18"/>
+                <w:szCs w:val="18"/>
+              </w:rPr>
+              <w:t xml:space="preserve">Visualización de alarmas (filtro por empleado y quiénes la visualizaron), log de alarmas de inventario, Track por entidad/objeto con ofuscación, logs de despachos y traslados, ajustes y tolerancias de OC, Log general (incluye Autómata de Existencias).</w:t>
+            </w:r>
+          </w:p>
+        </w:tc>
+        <w:tc>
+          <w:tcPr>
+            <w:tcW w:type="dxa" w:w="1400"/>
+            <w:tcBorders>
+              <w:top w:val="single" w:color="8EAADB" w:sz="4"/>
+              <w:left w:val="single" w:color="8EAADB" w:sz="4"/>
+              <w:bottom w:val="single" w:color="8EAADB" w:sz="4"/>
+              <w:right w:val="single" w:color="8EAADB" w:sz="4"/>
+            </w:tcBorders>
+            <w:shd w:fill="FFFFFF" w:color="auto" w:val="clear"/>
+            <w:tcMar>
+              <w:top w:type="dxa" w:w="60"/>
+              <w:left w:type="dxa" w:w="100"/>
+              <w:bottom w:type="dxa" w:w="60"/>
+              <w:right w:type="dxa" w:w="100"/>
+            </w:tcMar>
+          </w:tcPr>
+          <w:p>
+            <w:pPr>
+              <w:jc w:val="left"/>
+            </w:pPr>
+            <w:r>
+              <w:rPr>
+                <w:rFonts w:ascii="Century Gothic" w:cs="Century Gothic" w:eastAsia="Century Gothic" w:hAnsi="Century Gothic"/>
+                <w:b w:val="false"/>
+                <w:bCs w:val="false"/>
+                <w:sz w:val="18"/>
+                <w:szCs w:val="18"/>
+              </w:rPr>
+              <w:t xml:space="preserve">01–13, 15</w:t>
+            </w:r>
+          </w:p>
+        </w:tc>
+      </w:tr>
+      <w:tr>
+        <w:tc>
+          <w:tcPr>
+            <w:tcW w:type="dxa" w:w="2400"/>
+            <w:tcBorders>
+              <w:top w:val="single" w:color="8EAADB" w:sz="4"/>
+              <w:left w:val="single" w:color="8EAADB" w:sz="4"/>
+              <w:bottom w:val="single" w:color="8EAADB" w:sz="4"/>
+              <w:right w:val="single" w:color="8EAADB" w:sz="4"/>
+            </w:tcBorders>
+            <w:shd w:fill="DAE9F7" w:color="auto" w:val="clear"/>
+            <w:tcMar>
+              <w:top w:type="dxa" w:w="60"/>
+              <w:left w:type="dxa" w:w="100"/>
+              <w:bottom w:type="dxa" w:w="60"/>
+              <w:right w:type="dxa" w:w="100"/>
+            </w:tcMar>
+          </w:tcPr>
+          <w:p>
+            <w:pPr>
+              <w:jc w:val="left"/>
+            </w:pPr>
+            <w:r>
+              <w:rPr>
+                <w:rFonts w:ascii="Century Gothic" w:cs="Century Gothic" w:eastAsia="Century Gothic" w:hAnsi="Century Gothic"/>
+                <w:b/>
+                <w:bCs/>
+                <w:sz w:val="18"/>
+                <w:szCs w:val="18"/>
+              </w:rPr>
+              <w:t xml:space="preserve">2. Marca $ BOMBA</w:t>
+            </w:r>
+          </w:p>
+        </w:tc>
+        <w:tc>
+          <w:tcPr>
+            <w:tcW w:type="dxa" w:w="5560"/>
+            <w:tcBorders>
+              <w:top w:val="single" w:color="8EAADB" w:sz="4"/>
+              <w:left w:val="single" w:color="8EAADB" w:sz="4"/>
+              <w:bottom w:val="single" w:color="8EAADB" w:sz="4"/>
+              <w:right w:val="single" w:color="8EAADB" w:sz="4"/>
+            </w:tcBorders>
+            <w:shd w:fill="DAE9F7" w:color="auto" w:val="clear"/>
+            <w:tcMar>
+              <w:top w:type="dxa" w:w="60"/>
+              <w:left w:type="dxa" w:w="100"/>
+              <w:bottom w:type="dxa" w:w="60"/>
+              <w:right w:type="dxa" w:w="100"/>
+            </w:tcMar>
+          </w:tcPr>
+          <w:p>
+            <w:pPr>
+              <w:jc w:val="left"/>
+            </w:pPr>
+            <w:r>
+              <w:rPr>
+                <w:rFonts w:ascii="Century Gothic" w:cs="Century Gothic" w:eastAsia="Century Gothic" w:hAnsi="Century Gothic"/>
+                <w:b w:val="false"/>
+                <w:bCs w:val="false"/>
+                <w:sz w:val="18"/>
+                <w:szCs w:val="18"/>
+              </w:rPr>
+              <w:t xml:space="preserve">Marca Precio bomba en artículos (excluyente con Oferta), etiqueta en alarma/Excel de mínimos y filtros Sí/No/Todos en reportes.</w:t>
+            </w:r>
+          </w:p>
+        </w:tc>
+        <w:tc>
+          <w:tcPr>
+            <w:tcW w:type="dxa" w:w="1400"/>
+            <w:tcBorders>
+              <w:top w:val="single" w:color="8EAADB" w:sz="4"/>
+              <w:left w:val="single" w:color="8EAADB" w:sz="4"/>
+              <w:bottom w:val="single" w:color="8EAADB" w:sz="4"/>
+              <w:right w:val="single" w:color="8EAADB" w:sz="4"/>
+            </w:tcBorders>
+            <w:shd w:fill="DAE9F7" w:color="auto" w:val="clear"/>
+            <w:tcMar>
+              <w:top w:type="dxa" w:w="60"/>
+              <w:left w:type="dxa" w:w="100"/>
+              <w:bottom w:type="dxa" w:w="60"/>
+              <w:right w:type="dxa" w:w="100"/>
+            </w:tcMar>
+          </w:tcPr>
+          <w:p>
+            <w:pPr>
+              <w:jc w:val="left"/>
+            </w:pPr>
+            <w:r>
+              <w:rPr>
+                <w:rFonts w:ascii="Century Gothic" w:cs="Century Gothic" w:eastAsia="Century Gothic" w:hAnsi="Century Gothic"/>
+                <w:b w:val="false"/>
+                <w:bCs w:val="false"/>
+                <w:sz w:val="18"/>
+                <w:szCs w:val="18"/>
+              </w:rPr>
+              <w:t xml:space="preserve">14, 16</w:t>
+            </w:r>
+          </w:p>
+        </w:tc>
+      </w:tr>
+      <w:tr>
+        <w:tc>
+          <w:tcPr>
+            <w:tcW w:type="dxa" w:w="2400"/>
+            <w:tcBorders>
+              <w:top w:val="single" w:color="8EAADB" w:sz="4"/>
+              <w:left w:val="single" w:color="8EAADB" w:sz="4"/>
+              <w:bottom w:val="single" w:color="8EAADB" w:sz="4"/>
+              <w:right w:val="single" w:color="8EAADB" w:sz="4"/>
+            </w:tcBorders>
+            <w:shd w:fill="FFFFFF" w:color="auto" w:val="clear"/>
+            <w:tcMar>
+              <w:top w:type="dxa" w:w="60"/>
+              <w:left w:type="dxa" w:w="100"/>
+              <w:bottom w:type="dxa" w:w="60"/>
+              <w:right w:type="dxa" w:w="100"/>
+            </w:tcMar>
+          </w:tcPr>
+          <w:p>
+            <w:pPr>
+              <w:jc w:val="left"/>
+            </w:pPr>
+            <w:r>
+              <w:rPr>
+                <w:rFonts w:ascii="Century Gothic" w:cs="Century Gothic" w:eastAsia="Century Gothic" w:hAnsi="Century Gothic"/>
+                <w:b/>
+                <w:bCs/>
+                <w:sz w:val="18"/>
+                <w:szCs w:val="18"/>
+              </w:rPr>
+              <w:t xml:space="preserve">3. Pedido especial</w:t>
+            </w:r>
+          </w:p>
+        </w:tc>
+        <w:tc>
+          <w:tcPr>
+            <w:tcW w:type="dxa" w:w="5560"/>
+            <w:tcBorders>
+              <w:top w:val="single" w:color="8EAADB" w:sz="4"/>
+              <w:left w:val="single" w:color="8EAADB" w:sz="4"/>
+              <w:bottom w:val="single" w:color="8EAADB" w:sz="4"/>
+              <w:right w:val="single" w:color="8EAADB" w:sz="4"/>
+            </w:tcBorders>
+            <w:shd w:fill="FFFFFF" w:color="auto" w:val="clear"/>
+            <w:tcMar>
+              <w:top w:type="dxa" w:w="60"/>
+              <w:left w:type="dxa" w:w="100"/>
+              <w:bottom w:type="dxa" w:w="60"/>
+              <w:right w:type="dxa" w:w="100"/>
+            </w:tcMar>
+          </w:tcPr>
+          <w:p>
+            <w:pPr>
+              <w:jc w:val="left"/>
+            </w:pPr>
+            <w:r>
+              <w:rPr>
+                <w:rFonts w:ascii="Century Gothic" w:cs="Century Gothic" w:eastAsia="Century Gothic" w:hAnsi="Century Gothic"/>
+                <w:b w:val="false"/>
+                <w:bCs w:val="false"/>
+                <w:sz w:val="18"/>
+                <w:szCs w:val="18"/>
+              </w:rPr>
+              <w:t xml:space="preserve">Marca en el pedido, lista, detalle, resumen, reportes y exportaciones, logs, tablero, despachos y traslados.</w:t>
+            </w:r>
+          </w:p>
+        </w:tc>
+        <w:tc>
+          <w:tcPr>
+            <w:tcW w:type="dxa" w:w="1400"/>
+            <w:tcBorders>
+              <w:top w:val="single" w:color="8EAADB" w:sz="4"/>
+              <w:left w:val="single" w:color="8EAADB" w:sz="4"/>
+              <w:bottom w:val="single" w:color="8EAADB" w:sz="4"/>
+              <w:right w:val="single" w:color="8EAADB" w:sz="4"/>
+            </w:tcBorders>
+            <w:shd w:fill="FFFFFF" w:color="auto" w:val="clear"/>
+            <w:tcMar>
+              <w:top w:type="dxa" w:w="60"/>
+              <w:left w:type="dxa" w:w="100"/>
+              <w:bottom w:type="dxa" w:w="60"/>
+              <w:right w:type="dxa" w:w="100"/>
+            </w:tcMar>
+          </w:tcPr>
+          <w:p>
+            <w:pPr>
+              <w:jc w:val="left"/>
+            </w:pPr>
+            <w:r>
+              <w:rPr>
+                <w:rFonts w:ascii="Century Gothic" w:cs="Century Gothic" w:eastAsia="Century Gothic" w:hAnsi="Century Gothic"/>
+                <w:b w:val="false"/>
+                <w:bCs w:val="false"/>
+                <w:sz w:val="18"/>
+                <w:szCs w:val="18"/>
+              </w:rPr>
+              <w:t xml:space="preserve">17, 18, 19</w:t>
+            </w:r>
+          </w:p>
+        </w:tc>
+      </w:tr>
+      <w:tr>
+        <w:tc>
+          <w:tcPr>
+            <w:tcW w:type="dxa" w:w="2400"/>
+            <w:tcBorders>
+              <w:top w:val="single" w:color="8EAADB" w:sz="4"/>
+              <w:left w:val="single" w:color="8EAADB" w:sz="4"/>
+              <w:bottom w:val="single" w:color="8EAADB" w:sz="4"/>
+              <w:right w:val="single" w:color="8EAADB" w:sz="4"/>
+            </w:tcBorders>
+            <w:shd w:fill="DAE9F7" w:color="auto" w:val="clear"/>
+            <w:tcMar>
+              <w:top w:type="dxa" w:w="60"/>
+              <w:left w:type="dxa" w:w="100"/>
+              <w:bottom w:type="dxa" w:w="60"/>
+              <w:right w:type="dxa" w:w="100"/>
+            </w:tcMar>
+          </w:tcPr>
+          <w:p>
+            <w:pPr>
+              <w:jc w:val="left"/>
+            </w:pPr>
+            <w:r>
+              <w:rPr>
+                <w:rFonts w:ascii="Century Gothic" w:cs="Century Gothic" w:eastAsia="Century Gothic" w:hAnsi="Century Gothic"/>
+                <w:b/>
+                <w:bCs/>
+                <w:sz w:val="18"/>
+                <w:szCs w:val="18"/>
+              </w:rPr>
+              <w:t xml:space="preserve">4. Generador de consecutivos de referencia</w:t>
+            </w:r>
+          </w:p>
+        </w:tc>
+        <w:tc>
+          <w:tcPr>
+            <w:tcW w:type="dxa" w:w="5560"/>
+            <w:tcBorders>
+              <w:top w:val="single" w:color="8EAADB" w:sz="4"/>
+              <w:left w:val="single" w:color="8EAADB" w:sz="4"/>
+              <w:bottom w:val="single" w:color="8EAADB" w:sz="4"/>
+              <w:right w:val="single" w:color="8EAADB" w:sz="4"/>
+            </w:tcBorders>
+            <w:shd w:fill="DAE9F7" w:color="auto" w:val="clear"/>
+            <w:tcMar>
+              <w:top w:type="dxa" w:w="60"/>
+              <w:left w:type="dxa" w:w="100"/>
+              <w:bottom w:type="dxa" w:w="60"/>
+              <w:right w:type="dxa" w:w="100"/>
+            </w:tcMar>
+          </w:tcPr>
+          <w:p>
+            <w:pPr>
+              <w:jc w:val="left"/>
+            </w:pPr>
+            <w:r>
+              <w:rPr>
+                <w:rFonts w:ascii="Century Gothic" w:cs="Century Gothic" w:eastAsia="Century Gothic" w:hAnsi="Century Gothic"/>
+                <w:b w:val="false"/>
+                <w:bCs w:val="false"/>
+                <w:sz w:val="18"/>
+                <w:szCs w:val="18"/>
+              </w:rPr>
+              <w:t xml:space="preserve">Sugerencia de referencias internas CÓDIGO-NNN libres.</w:t>
+            </w:r>
+          </w:p>
+        </w:tc>
+        <w:tc>
+          <w:tcPr>
+            <w:tcW w:type="dxa" w:w="1400"/>
+            <w:tcBorders>
+              <w:top w:val="single" w:color="8EAADB" w:sz="4"/>
+              <w:left w:val="single" w:color="8EAADB" w:sz="4"/>
+              <w:bottom w:val="single" w:color="8EAADB" w:sz="4"/>
+              <w:right w:val="single" w:color="8EAADB" w:sz="4"/>
+            </w:tcBorders>
+            <w:shd w:fill="DAE9F7" w:color="auto" w:val="clear"/>
+            <w:tcMar>
+              <w:top w:type="dxa" w:w="60"/>
+              <w:left w:type="dxa" w:w="100"/>
+              <w:bottom w:type="dxa" w:w="60"/>
+              <w:right w:type="dxa" w:w="100"/>
+            </w:tcMar>
+          </w:tcPr>
+          <w:p>
+            <w:pPr>
+              <w:jc w:val="left"/>
+            </w:pPr>
+            <w:r>
+              <w:rPr>
+                <w:rFonts w:ascii="Century Gothic" w:cs="Century Gothic" w:eastAsia="Century Gothic" w:hAnsi="Century Gothic"/>
+                <w:b w:val="false"/>
+                <w:bCs w:val="false"/>
+                <w:sz w:val="18"/>
+                <w:szCs w:val="18"/>
+              </w:rPr>
+              <w:t xml:space="preserve">20</w:t>
+            </w:r>
+          </w:p>
+        </w:tc>
+      </w:tr>
+    </w:tbl>
+    <w:p>
+      <w:pPr>
+        <w:spacing w:after="120" w:line="276"/>
+      </w:pPr>
+      <w:r>
+        <w:rPr>
+          <w:rFonts w:ascii="Century Gothic" w:cs="Century Gothic" w:eastAsia="Century Gothic" w:hAnsi="Century Gothic"/>
+          <w:sz w:val="20"/>
+          <w:szCs w:val="20"/>
+        </w:rPr>
+        <w:t xml:space="preserve">Incluye objetos de base de datos, componentes por capa, seguridad, despliegue, reversa y soporte.</w:t>
       </w:r>
     </w:p>
     <w:p>
@@ -1313,7 +1855,7 @@
                 <w:sz w:val="18"/>
                 <w:szCs w:val="18"/>
               </w:rPr>
-              <w:t xml:space="preserve">Enmascara credenciales en el histórico de log.track (por lotes).</w:t>
+              <w:t xml:space="preserve">Enmascara credenciales en el histórico de log.track (por lotes) y verifica con OUTER APPLY que no queden valores sin ofuscar.</w:t>
             </w:r>
           </w:p>
         </w:tc>
@@ -1414,7 +1956,7 @@
                 <w:sz w:val="18"/>
                 <w:szCs w:val="18"/>
               </w:rPr>
-              <w:t xml:space="preserve">ALARM_VISUALIZATION_LOG_TYPES, VW_ALARM_LOG, VW_ALARM_LOG_VISUALIZATIONS, SP de consulta y roles nuevos.</w:t>
+              <w:t xml:space="preserve">ALARM_VISUALIZATION_LOG_TYPES, VW_ALARM_LOG, VW_ALARM_LOG_VISUALIZATIONS, SP_GET_ALARM_LOG (@EmployeeId; solo alarmas visualizadas), SP_GET_ALARM_LOG_VISUALIZERS y roles nuevos.</w:t>
             </w:r>
           </w:p>
         </w:tc>
@@ -2896,7 +3438,7 @@
                 <w:sz w:val="18"/>
                 <w:szCs w:val="18"/>
               </w:rPr>
-              <w:t xml:space="preserve">E4 C1</w:t>
+              <w:t xml:space="preserve">T31</w:t>
             </w:r>
           </w:p>
         </w:tc>
@@ -3809,7 +4351,7 @@
           <w:sz w:val="24"/>
           <w:szCs w:val="24"/>
         </w:rPr>
-        <w:t xml:space="preserve">Logs y Track (Entregas 1 y 2)</w:t>
+        <w:t xml:space="preserve">Requerimiento 1 – Logs</w:t>
       </w:r>
     </w:p>
     <w:tbl>
@@ -4557,7 +5099,7 @@
           <w:sz w:val="21"/>
           <w:szCs w:val="21"/>
         </w:rPr>
-        <w:t xml:space="preserve">Ofuscación en el Track</w:t>
+        <w:t xml:space="preserve">Visualización de alarmas</w:t>
       </w:r>
     </w:p>
     <w:p>
@@ -4570,7 +5112,7 @@
           <w:sz w:val="20"/>
           <w:szCs w:val="20"/>
         </w:rPr>
-        <w:t xml:space="preserve">Atributo </w:t>
+        <w:t xml:space="preserve">Pantalla </w:t>
       </w:r>
       <w:r>
         <w:rPr>
@@ -4580,7 +5122,7 @@
           <w:sz w:val="20"/>
           <w:szCs w:val="20"/>
         </w:rPr>
-        <w:t xml:space="preserve">[TrackMasked]</w:t>
+        <w:t xml:space="preserve">AlarmVisualizationLog</w:t>
       </w:r>
       <w:r>
         <w:rPr>
@@ -4588,7 +5130,7 @@
           <w:sz w:val="20"/>
           <w:szCs w:val="20"/>
         </w:rPr>
-        <w:t xml:space="preserve"> y </w:t>
+        <w:t xml:space="preserve">: grilla de alarmas del contexto con filtro de fechas y </w:t>
       </w:r>
       <w:r>
         <w:rPr>
@@ -4598,7 +5140,7 @@
           <w:sz w:val="20"/>
           <w:szCs w:val="20"/>
         </w:rPr>
-        <w:t xml:space="preserve">TrackValueMasker</w:t>
+        <w:t xml:space="preserve">filtro Empleado</w:t>
       </w:r>
       <w:r>
         <w:rPr>
@@ -4606,7 +5148,7 @@
           <w:sz w:val="20"/>
           <w:szCs w:val="20"/>
         </w:rPr>
-        <w:t xml:space="preserve">: el Track guarda "******</w:t>
+        <w:t xml:space="preserve"> (lista de SP_GET_ALARM_LOG_VISUALIZERS). Solo se listan alarmas que alguien visualizó (EXISTS sobre VW_ALARM_LOG_VISUALIZATIONS); con empleado, solo las que él visualizó. Al expandir una fila (RowExpand) se carga la subgrilla Empleado / Área / Fecha de visualización. Entidad keyless </w:t>
       </w:r>
       <w:r>
         <w:rPr>
@@ -4616,7 +5158,45 @@
           <w:sz w:val="20"/>
           <w:szCs w:val="20"/>
         </w:rPr>
-        <w:t xml:space="preserve">" o "</w:t>
+        <w:t xml:space="preserve">AlarmLogVisualizer</w:t>
+      </w:r>
+      <w:r>
+        <w:rPr>
+          <w:rFonts w:ascii="Century Gothic" w:cs="Century Gothic" w:eastAsia="Century Gothic" w:hAnsi="Century Gothic"/>
+          <w:sz w:val="20"/>
+          <w:szCs w:val="20"/>
+        </w:rPr>
+        <w:t xml:space="preserve">; AlarmLogService.GetAlarmsAsync(…, employeeId) y GetVisualizersAsync.</w:t>
+      </w:r>
+    </w:p>
+    <w:p>
+      <w:pPr>
+        <w:pStyle w:val="Heading3"/>
+        <w:spacing w:after="80" w:before="160"/>
+      </w:pPr>
+      <w:r>
+        <w:rPr>
+          <w:rFonts w:ascii="Century Gothic" w:cs="Century Gothic" w:eastAsia="Century Gothic" w:hAnsi="Century Gothic"/>
+          <w:b/>
+          <w:bCs/>
+          <w:color w:val="215E99"/>
+          <w:sz w:val="21"/>
+          <w:szCs w:val="21"/>
+        </w:rPr>
+        <w:t xml:space="preserve">Ofuscación en el Track</w:t>
+      </w:r>
+    </w:p>
+    <w:p>
+      <w:pPr>
+        <w:spacing w:after="120" w:line="276"/>
+      </w:pPr>
+      <w:r>
+        <w:rPr>
+          <w:rFonts w:ascii="Century Gothic" w:cs="Century Gothic" w:eastAsia="Century Gothic" w:hAnsi="Century Gothic"/>
+          <w:sz w:val="20"/>
+          <w:szCs w:val="20"/>
+        </w:rPr>
+        <w:t xml:space="preserve">Atributo </w:t>
       </w:r>
       <w:r>
         <w:rPr>
@@ -4626,7 +5206,53 @@
           <w:sz w:val="20"/>
           <w:szCs w:val="20"/>
         </w:rPr>
-        <w:t xml:space="preserve">**** (modificada)"; nunca el valor ni un hash. Campos marcados: FtpWritingConnection.Password, InventoryAutomationConnection.Password y NotificationProviderSetting.Settings (claves password, pwd, secret, token del JSON). 19 entidades adicionales implementan ITrackeabl</w:t>
+        <w:t xml:space="preserve">[TrackMasked]</w:t>
+      </w:r>
+      <w:r>
+        <w:rPr>
+          <w:rFonts w:ascii="Century Gothic" w:cs="Century Gothic" w:eastAsia="Century Gothic" w:hAnsi="Century Gothic"/>
+          <w:sz w:val="20"/>
+          <w:szCs w:val="20"/>
+        </w:rPr>
+        <w:t xml:space="preserve"> y </w:t>
+      </w:r>
+      <w:r>
+        <w:rPr>
+          <w:rFonts w:ascii="Century Gothic" w:cs="Century Gothic" w:eastAsia="Century Gothic" w:hAnsi="Century Gothic"/>
+          <w:b/>
+          <w:bCs/>
+          <w:sz w:val="20"/>
+          <w:szCs w:val="20"/>
+        </w:rPr>
+        <w:t xml:space="preserve">TrackValueMasker</w:t>
+      </w:r>
+      <w:r>
+        <w:rPr>
+          <w:rFonts w:ascii="Century Gothic" w:cs="Century Gothic" w:eastAsia="Century Gothic" w:hAnsi="Century Gothic"/>
+          <w:sz w:val="20"/>
+          <w:szCs w:val="20"/>
+        </w:rPr>
+        <w:t xml:space="preserve">: el Track guarda "******</w:t>
+      </w:r>
+      <w:r>
+        <w:rPr>
+          <w:rFonts w:ascii="Century Gothic" w:cs="Century Gothic" w:eastAsia="Century Gothic" w:hAnsi="Century Gothic"/>
+          <w:b/>
+          <w:bCs/>
+          <w:sz w:val="20"/>
+          <w:szCs w:val="20"/>
+        </w:rPr>
+        <w:t xml:space="preserve">" o "</w:t>
+      </w:r>
+      <w:r>
+        <w:rPr>
+          <w:rFonts w:ascii="Century Gothic" w:cs="Century Gothic" w:eastAsia="Century Gothic" w:hAnsi="Century Gothic"/>
+          <w:b/>
+          <w:bCs/>
+          <w:sz w:val="20"/>
+          <w:szCs w:val="20"/>
+        </w:rPr>
+        <w:t xml:space="preserve">**** (modificada)"; nunca el valor ni un hash. Campos marcados: FtpWritingConnection.Password, InventoryAutomationConnection.Password y NotificationProviderSetting.Settings (claves password, pwd, secret, token del JSON). 19 entidades adicionales implementan ITrackeable. TrackDataParser muestra los booleanos como Sí/N</w:t>
       </w:r>
     </w:p>
     <w:p>
@@ -4643,7 +5269,7 @@
           <w:sz w:val="24"/>
           <w:szCs w:val="24"/>
         </w:rPr>
-        <w:t xml:space="preserve">Precio bomba (T8, T9, T20–T22b)</w:t>
+        <w:t xml:space="preserve">Requerimiento 2 – Marca $ BOMBA (T8, T9, T20–T22b)</w:t>
       </w:r>
     </w:p>
     <w:p>
@@ -4714,7 +5340,7 @@
           <w:sz w:val="24"/>
           <w:szCs w:val="24"/>
         </w:rPr>
-        <w:t xml:space="preserve">Pedido especial (T23–T28)</w:t>
+        <w:t xml:space="preserve">Requerimiento 3 – Pedido especial (T23–T28)</w:t>
       </w:r>
     </w:p>
     <w:tbl>
@@ -5229,7 +5855,7 @@
           <w:sz w:val="24"/>
           <w:szCs w:val="24"/>
         </w:rPr>
-        <w:t xml:space="preserve">Consecutivos de referencia interna (E4)</w:t>
+        <w:t xml:space="preserve">Requerimiento 4 – Generador de consecutivos de referencia interna</w:t>
       </w:r>
     </w:p>
     <w:p>
@@ -5306,7 +5932,7 @@
           <w:sz w:val="20"/>
           <w:szCs w:val="20"/>
         </w:rPr>
-        <w:t xml:space="preserve">; las tablas de E4 solo guardan sugerencias pendientes y se depuran contra items en cada Consultar/Generar. La única protección contra duplicados al crear el artículo es la existente: validación ExistsByIternalReference en AddItem e índice único UQ_INTERNAL_REF.</w:t>
+        <w:t xml:space="preserve">; las tablas del generador solo guardan sugerencias pendientes y se depuran contra items en cada Consultar/Generar. La única protección contra duplicados al crear el artículo es la existente: validación ExistsByIternalReference en AddItem e índice único UQ_INTERNAL_REF.</w:t>
       </w:r>
     </w:p>
     <w:p>

</xml_diff>

<commit_message>
RQM Complemento Logs - Reversa completa (todos los scripts) y corrección del índice de objetos del Track
- Reversas nuevas 01, 03 y 06-13; la 04 borra INVENTORY_ALARM_LOG y solo restaura sus propios objetos.
- 08: FN_TRACK_OBJECTS fallaba (Msg 8152) con valores de más de 4000 caracteres; el trigger
  impedía guardar esos movimientos y la carga histórica saltaba lotes. La carga ahora usa XACT_ABORT.
- P05 soporta el log vacío. LEEME y manuales con el orden completo de reversa.

Co-Authored-By: Claude Opus 5.5 <noreply@anthropic.com>
Claude-Session: https://claude.ai/code/session_01BJBf3VznR328nVdwrkfCSa
</commit_message>
<xml_diff>
--- a/documentos/2026-10-20 RQM Complemento de Modúlo de consulta de logs/T17 - Manual Tecnico.docx
+++ b/documentos/2026-10-20 RQM Complemento de Modúlo de consulta de logs/T17 - Manual Tecnico.docx
@@ -3553,7 +3553,7 @@
           <w:sz w:val="20"/>
           <w:szCs w:val="20"/>
         </w:rPr>
-        <w:t xml:space="preserve">Reversas disponibles en </w:t>
+        <w:t xml:space="preserve">Cada script tiene su reversa en </w:t>
       </w:r>
       <w:r>
         <w:rPr>
@@ -3571,7 +3571,7 @@
           <w:sz w:val="20"/>
           <w:szCs w:val="20"/>
         </w:rPr>
-        <w:t xml:space="preserve">: 04, 05, 14, 15, 16, 17, 18, 19 y 20. Antes de ejecutar una reversa se publica la versión de la aplicación sin la funcionalidad correspondiente.</w:t>
+        <w:t xml:space="preserve">, excepto el 02: la ofuscación no se puede deshacer porque los valores originales nunca se guardan. La reversa completa deja la BD como estaba antes del requerimiento. Solo se pierden los datos propios del requerimiento: marcas Pedido especial y Precio bomba, consecutivos sugeridos e historial de los logs nuevos. Los pedidos y artículos se conservan.</w:t>
       </w:r>
     </w:p>
     <w:p>
@@ -4013,7 +4013,7 @@
                 <w:sz w:val="18"/>
                 <w:szCs w:val="18"/>
               </w:rPr>
-              <w:t xml:space="preserve">Índice (tipo de objeto, Id, fecha, movimiento) para buscar en el Track por pedido, OC, artículo, etc.</w:t>
+              <w:t xml:space="preserve">Índice (tipo de objeto, Id, fecha, movimiento) para buscar en el Track por pedido, OC, artículo, etc. FN_TRACK_OBJECTS solo convierte valores cortos (≤ 20 caracteres): un valor de más de 4000 caracteres, como el mensaje de una plantilla, hacía fallar el trigger.</w:t>
             </w:r>
           </w:p>
         </w:tc>
@@ -8314,7 +8314,7 @@
           <w:sz w:val="20"/>
           <w:szCs w:val="20"/>
         </w:rPr>
-        <w:t xml:space="preserve">Publicar la versión anterior de la aplicación y ejecutar las reversas en orden inverso (20, 19, 18, 17, 16, 15, 14, 05, 04). Las tablas de log se conservan.</w:t>
+        <w:t xml:space="preserve">Publicar la versión anterior de la aplicación, restaurar el NLog.config anterior del autómata y ejecutar todas las reversas en orden inverso: 20, 19, 18, 17, 16, 15, 14, 13, 12, 11, 10, 09, 08, 07, 06, 05, 04, 03, 01. La 01 va de última porque borra la tabla de respaldo RQM_LOGS_OBJECT_BACKUP, que usan las reversas 04, 05, 14, 16 y 18. Ciclo completo reversa → despliegue probado sin errores.</w:t>
       </w:r>
     </w:p>
     <w:p>

</xml_diff>

<commit_message>
RQM Complemento Logs - Script 21: log de ArchivosTotvs en el Log general (+ reversa y manuales)
Co-Authored-By: Claude Opus 5.5 <noreply@anthropic.com>
Claude-Session: https://claude.ai/code/session_01BJBf3VznR328nVdwrkfCSa
</commit_message>
<xml_diff>
--- a/documentos/2026-10-20 RQM Complemento de Modúlo de consulta de logs/T17 - Manual Tecnico.docx
+++ b/documentos/2026-10-20 RQM Complemento de Modúlo de consulta de logs/T17 - Manual Tecnico.docx
@@ -3476,6 +3476,107 @@
           </w:p>
         </w:tc>
       </w:tr>
+      <w:tr>
+        <w:tc>
+          <w:tcPr>
+            <w:tcW w:type="dxa" w:w="2600"/>
+            <w:tcBorders>
+              <w:top w:val="single" w:color="8EAADB" w:sz="4"/>
+              <w:left w:val="single" w:color="8EAADB" w:sz="4"/>
+              <w:bottom w:val="single" w:color="8EAADB" w:sz="4"/>
+              <w:right w:val="single" w:color="8EAADB" w:sz="4"/>
+            </w:tcBorders>
+            <w:shd w:fill="FFFFFF" w:color="auto" w:val="clear"/>
+            <w:tcMar>
+              <w:top w:type="dxa" w:w="60"/>
+              <w:left w:type="dxa" w:w="100"/>
+              <w:bottom w:type="dxa" w:w="60"/>
+              <w:right w:type="dxa" w:w="100"/>
+            </w:tcMar>
+          </w:tcPr>
+          <w:p>
+            <w:pPr>
+              <w:jc w:val="left"/>
+            </w:pPr>
+            <w:r>
+              <w:rPr>
+                <w:rFonts w:ascii="Century Gothic" w:cs="Century Gothic" w:eastAsia="Century Gothic" w:hAnsi="Century Gothic"/>
+                <w:b/>
+                <w:bCs/>
+                <w:sz w:val="18"/>
+                <w:szCs w:val="18"/>
+              </w:rPr>
+              <w:t xml:space="preserve">21 - Log archivos totvs</w:t>
+            </w:r>
+          </w:p>
+        </w:tc>
+        <w:tc>
+          <w:tcPr>
+            <w:tcW w:type="dxa" w:w="1100"/>
+            <w:tcBorders>
+              <w:top w:val="single" w:color="8EAADB" w:sz="4"/>
+              <w:left w:val="single" w:color="8EAADB" w:sz="4"/>
+              <w:bottom w:val="single" w:color="8EAADB" w:sz="4"/>
+              <w:right w:val="single" w:color="8EAADB" w:sz="4"/>
+            </w:tcBorders>
+            <w:shd w:fill="FFFFFF" w:color="auto" w:val="clear"/>
+            <w:tcMar>
+              <w:top w:type="dxa" w:w="60"/>
+              <w:left w:type="dxa" w:w="100"/>
+              <w:bottom w:type="dxa" w:w="60"/>
+              <w:right w:type="dxa" w:w="100"/>
+            </w:tcMar>
+          </w:tcPr>
+          <w:p>
+            <w:pPr>
+              <w:jc w:val="left"/>
+            </w:pPr>
+            <w:r>
+              <w:rPr>
+                <w:rFonts w:ascii="Century Gothic" w:cs="Century Gothic" w:eastAsia="Century Gothic" w:hAnsi="Century Gothic"/>
+                <w:b w:val="false"/>
+                <w:bCs w:val="false"/>
+                <w:sz w:val="18"/>
+                <w:szCs w:val="18"/>
+              </w:rPr>
+              <w:t xml:space="preserve">T15c</w:t>
+            </w:r>
+          </w:p>
+        </w:tc>
+        <w:tc>
+          <w:tcPr>
+            <w:tcW w:type="dxa" w:w="5660"/>
+            <w:tcBorders>
+              <w:top w:val="single" w:color="8EAADB" w:sz="4"/>
+              <w:left w:val="single" w:color="8EAADB" w:sz="4"/>
+              <w:bottom w:val="single" w:color="8EAADB" w:sz="4"/>
+              <w:right w:val="single" w:color="8EAADB" w:sz="4"/>
+            </w:tcBorders>
+            <w:shd w:fill="FFFFFF" w:color="auto" w:val="clear"/>
+            <w:tcMar>
+              <w:top w:type="dxa" w:w="60"/>
+              <w:left w:type="dxa" w:w="100"/>
+              <w:bottom w:type="dxa" w:w="60"/>
+              <w:right w:type="dxa" w:w="100"/>
+            </w:tcMar>
+          </w:tcPr>
+          <w:p>
+            <w:pPr>
+              <w:jc w:val="left"/>
+            </w:pPr>
+            <w:r>
+              <w:rPr>
+                <w:rFonts w:ascii="Century Gothic" w:cs="Century Gothic" w:eastAsia="Century Gothic" w:hAnsi="Century Gothic"/>
+                <w:b w:val="false"/>
+                <w:bCs w:val="false"/>
+                <w:sz w:val="18"/>
+                <w:szCs w:val="18"/>
+              </w:rPr>
+              <w:t xml:space="preserve">log.SP_INSERT_ARCHIVOS_TOTVS_LOG (+ NLog.config y paquete NLog.Database de Totvs.FlatFileGenerator). Misma lógica del 13 con origen ArchivosTotvs.</w:t>
+            </w:r>
+          </w:p>
+        </w:tc>
+      </w:tr>
     </w:tbl>
     <w:p>
       <w:pPr>
@@ -8184,7 +8285,7 @@
           <w:sz w:val="20"/>
           <w:szCs w:val="20"/>
         </w:rPr>
-        <w:t xml:space="preserve"> en orden (01–20) sobre la BD Aldebaran. Los scripts 16, 18 y 19 se ejecutan en la misma ventana en que se publica la aplicación.</w:t>
+        <w:t xml:space="preserve"> en orden (01–21) sobre la BD Aldebaran. Los scripts 16, 18 y 19 se ejecutan en la misma ventana en que se publica la aplicación.</w:t>
       </w:r>
     </w:p>
     <w:p>
@@ -8248,7 +8349,7 @@
           <w:sz w:val="20"/>
           <w:szCs w:val="20"/>
         </w:rPr>
-        <w:t xml:space="preserve">Validar el script 05 con permisos sobre msdb.</w:t>
+        <w:t xml:space="preserve">ArchivosTotvs: publicar el servicio con el paquete NLog.Database y el NLog.config actualizado (target asyncDatabase → log.SP_INSERT_ARCHIVOS_TOTVS_LOG, cadena ConnectionStrings:AldebaranDbConnection), dar EXECUTE a su usuario de BD y reiniciarlo.</w:t>
       </w:r>
     </w:p>
     <w:p>
@@ -8266,7 +8367,7 @@
           <w:sz w:val="20"/>
           <w:szCs w:val="20"/>
         </w:rPr>
-        <w:t xml:space="preserve">Asignar los roles nuevos (Log del sistema, Log de inventarios) a los usuarios que correspondan.</w:t>
+        <w:t xml:space="preserve">Validar el script 05 con permisos sobre msdb.</w:t>
       </w:r>
     </w:p>
     <w:p>
@@ -8284,7 +8385,25 @@
           <w:sz w:val="20"/>
           <w:szCs w:val="20"/>
         </w:rPr>
-        <w:t xml:space="preserve">Verificación: abrir Log general y confirmar el origen AutomataExistencias; crear un pedido de prueba con Pedido especial; ejecutar un reporte de pedidos.</w:t>
+        <w:t xml:space="preserve">Asignar los roles nuevos (Log del sistema, Log de inventarios) a los usuarios que correspondan.</w:t>
+      </w:r>
+    </w:p>
+    <w:p>
+      <w:pPr>
+        <w:pStyle w:val="ListParagraph"/>
+        <w:numPr>
+          <w:ilvl w:val="0"/>
+          <w:numId w:val="3"/>
+        </w:numPr>
+        <w:spacing w:after="60"/>
+      </w:pPr>
+      <w:r>
+        <w:rPr>
+          <w:rFonts w:ascii="Century Gothic" w:cs="Century Gothic" w:eastAsia="Century Gothic" w:hAnsi="Century Gothic"/>
+          <w:sz w:val="20"/>
+          <w:szCs w:val="20"/>
+        </w:rPr>
+        <w:t xml:space="preserve">Verificación: abrir Log general y confirmar los orígenes AutomataExistencias y ArchivosTotvs; crear un pedido de prueba con Pedido especial; ejecutar un reporte de pedidos.</w:t>
       </w:r>
     </w:p>
     <w:p>
@@ -8314,7 +8433,7 @@
           <w:sz w:val="20"/>
           <w:szCs w:val="20"/>
         </w:rPr>
-        <w:t xml:space="preserve">Publicar la versión anterior de la aplicación, restaurar el NLog.config anterior del autómata y ejecutar todas las reversas en orden inverso: 20, 19, 18, 17, 16, 15, 14, 13, 12, 11, 10, 09, 08, 07, 06, 05, 04, 03, 01. La 01 va de última porque borra la tabla de respaldo RQM_LOGS_OBJECT_BACKUP, que usan las reversas 04, 05, 14, 16 y 18. Ciclo completo reversa → despliegue probado sin errores.</w:t>
+        <w:t xml:space="preserve">Publicar la versión anterior de la aplicación, restaurar el NLog.config anterior del autómata y la versión anterior de ArchivosTotvs, y ejecutar todas las reversas en orden inverso: 21, 20, 19, 18, 17, 16, 15, 14, 13, 12, 11, 10, 09, 08, 07, 06, 05, 04, 03, 01. La 01 va de última porque borra la tabla de respaldo RQM_LOGS_OBJECT_BACKUP, que usan las reversas 04, 05, 14, 16 y 18. Ciclo completo reversa → despliegue probado sin errores.</w:t>
       </w:r>
     </w:p>
     <w:p>
@@ -8789,7 +8908,7 @@
                 <w:sz w:val="18"/>
                 <w:szCs w:val="18"/>
               </w:rPr>
-              <w:t xml:space="preserve">No aparece el origen AutomataExistencias.</w:t>
+              <w:t xml:space="preserve">No aparece el origen AutomataExistencias o ArchivosTotvs.</w:t>
             </w:r>
           </w:p>
         </w:tc>
@@ -8822,7 +8941,7 @@
                 <w:sz w:val="18"/>
                 <w:szCs w:val="18"/>
               </w:rPr>
-              <w:t xml:space="preserve">NLog.config no desplegado o sin permiso EXECUTE.</w:t>
+              <w:t xml:space="preserve">NLog.config (o paquete NLog.Database en ArchivosTotvs) no desplegado, o sin permiso EXECUTE.</w:t>
             </w:r>
           </w:p>
         </w:tc>
@@ -8855,7 +8974,7 @@
                 <w:sz w:val="18"/>
                 <w:szCs w:val="18"/>
               </w:rPr>
-              <w:t xml:space="preserve">Revisar el despliegue del autómata.</w:t>
+              <w:t xml:space="preserve">Revisar el despliegue del servicio.</w:t>
             </w:r>
           </w:p>
         </w:tc>

</xml_diff>

<commit_message>
RQM Complemento Logs - Track: nombre de los Id paramétricos en el detalle (estado, motivos, bodegas...)
FN_TRACK_LOOKUP_DESCRIPTION y SP_GET_TRACK_OBJECT_DESCRIPTIONS; el SP tampoco falla ya con valores
de más de 4000 caracteres. Reversa 08 y manual técnico actualizados.

Co-Authored-By: Claude Opus 5.5 <noreply@anthropic.com>
Claude-Session: https://claude.ai/code/session_01BJBf3VznR328nVdwrkfCSa
</commit_message>
<xml_diff>
--- a/documentos/2026-10-20 RQM Complemento de Modúlo de consulta de logs/T17 - Manual Tecnico.docx
+++ b/documentos/2026-10-20 RQM Complemento de Modúlo de consulta de logs/T17 - Manual Tecnico.docx
@@ -4149,7 +4149,7 @@
                 <w:sz w:val="18"/>
                 <w:szCs w:val="18"/>
               </w:rPr>
-              <w:t xml:space="preserve">RQM_LOGS_OBJECT_BACKUP</w:t>
+              <w:t xml:space="preserve">FN_TRACK_LOOKUP_DESCRIPTION</w:t>
             </w:r>
           </w:p>
         </w:tc>
@@ -4182,7 +4182,7 @@
                 <w:sz w:val="18"/>
                 <w:szCs w:val="18"/>
               </w:rPr>
-              <w:t xml:space="preserve">Tabla</w:t>
+              <w:t xml:space="preserve">Función</w:t>
             </w:r>
           </w:p>
         </w:tc>
@@ -4215,7 +4215,7 @@
                 <w:sz w:val="18"/>
                 <w:szCs w:val="18"/>
               </w:rPr>
-              <w:t xml:space="preserve">Definiciones originales para reversa.</w:t>
+              <w:t xml:space="preserve">Nombre de los Id paramétricos en el detalle del Track (estado del documento, motivos de cancelación/modificación/cierre/ajuste, tipo de ajuste, bodegas, ciudad, tipo de identificación, método de envío, satélite, línea, moneda, unidades, agente, alarma, plantilla): "10 · Pendiente". Solo para mostrar; no se indexan como objetos.</w:t>
             </w:r>
           </w:p>
         </w:tc>
@@ -4250,7 +4250,7 @@
                 <w:sz w:val="18"/>
                 <w:szCs w:val="18"/>
               </w:rPr>
-              <w:t xml:space="preserve">items.IS_BOMB_PRICE</w:t>
+              <w:t xml:space="preserve">RQM_LOGS_OBJECT_BACKUP</w:t>
             </w:r>
           </w:p>
         </w:tc>
@@ -4283,7 +4283,7 @@
                 <w:sz w:val="18"/>
                 <w:szCs w:val="18"/>
               </w:rPr>
-              <w:t xml:space="preserve">Columna</w:t>
+              <w:t xml:space="preserve">Tabla</w:t>
             </w:r>
           </w:p>
         </w:tc>
@@ -4316,7 +4316,7 @@
                 <w:sz w:val="18"/>
                 <w:szCs w:val="18"/>
               </w:rPr>
-              <w:t xml:space="preserve">Marca Precio bomba (excluyente con IS_SALE_OFF; la regla la aplica la aplicación).</w:t>
+              <w:t xml:space="preserve">Definiciones originales para reversa.</w:t>
             </w:r>
           </w:p>
         </w:tc>
@@ -4351,6 +4351,107 @@
                 <w:sz w:val="18"/>
                 <w:szCs w:val="18"/>
               </w:rPr>
+              <w:t xml:space="preserve">items.IS_BOMB_PRICE</w:t>
+            </w:r>
+          </w:p>
+        </w:tc>
+        <w:tc>
+          <w:tcPr>
+            <w:tcW w:type="dxa" w:w="1200"/>
+            <w:tcBorders>
+              <w:top w:val="single" w:color="8EAADB" w:sz="4"/>
+              <w:left w:val="single" w:color="8EAADB" w:sz="4"/>
+              <w:bottom w:val="single" w:color="8EAADB" w:sz="4"/>
+              <w:right w:val="single" w:color="8EAADB" w:sz="4"/>
+            </w:tcBorders>
+            <w:shd w:fill="DAE9F7" w:color="auto" w:val="clear"/>
+            <w:tcMar>
+              <w:top w:type="dxa" w:w="60"/>
+              <w:left w:type="dxa" w:w="100"/>
+              <w:bottom w:type="dxa" w:w="60"/>
+              <w:right w:type="dxa" w:w="100"/>
+            </w:tcMar>
+          </w:tcPr>
+          <w:p>
+            <w:pPr>
+              <w:jc w:val="left"/>
+            </w:pPr>
+            <w:r>
+              <w:rPr>
+                <w:rFonts w:ascii="Century Gothic" w:cs="Century Gothic" w:eastAsia="Century Gothic" w:hAnsi="Century Gothic"/>
+                <w:b w:val="false"/>
+                <w:bCs w:val="false"/>
+                <w:sz w:val="18"/>
+                <w:szCs w:val="18"/>
+              </w:rPr>
+              <w:t xml:space="preserve">Columna</w:t>
+            </w:r>
+          </w:p>
+        </w:tc>
+        <w:tc>
+          <w:tcPr>
+            <w:tcW w:type="dxa" w:w="4760"/>
+            <w:tcBorders>
+              <w:top w:val="single" w:color="8EAADB" w:sz="4"/>
+              <w:left w:val="single" w:color="8EAADB" w:sz="4"/>
+              <w:bottom w:val="single" w:color="8EAADB" w:sz="4"/>
+              <w:right w:val="single" w:color="8EAADB" w:sz="4"/>
+            </w:tcBorders>
+            <w:shd w:fill="DAE9F7" w:color="auto" w:val="clear"/>
+            <w:tcMar>
+              <w:top w:type="dxa" w:w="60"/>
+              <w:left w:type="dxa" w:w="100"/>
+              <w:bottom w:type="dxa" w:w="60"/>
+              <w:right w:type="dxa" w:w="100"/>
+            </w:tcMar>
+          </w:tcPr>
+          <w:p>
+            <w:pPr>
+              <w:jc w:val="left"/>
+            </w:pPr>
+            <w:r>
+              <w:rPr>
+                <w:rFonts w:ascii="Century Gothic" w:cs="Century Gothic" w:eastAsia="Century Gothic" w:hAnsi="Century Gothic"/>
+                <w:b w:val="false"/>
+                <w:bCs w:val="false"/>
+                <w:sz w:val="18"/>
+                <w:szCs w:val="18"/>
+              </w:rPr>
+              <w:t xml:space="preserve">Marca Precio bomba (excluyente con IS_SALE_OFF; la regla la aplica la aplicación).</w:t>
+            </w:r>
+          </w:p>
+        </w:tc>
+      </w:tr>
+      <w:tr>
+        <w:tc>
+          <w:tcPr>
+            <w:tcW w:type="dxa" w:w="3400"/>
+            <w:tcBorders>
+              <w:top w:val="single" w:color="8EAADB" w:sz="4"/>
+              <w:left w:val="single" w:color="8EAADB" w:sz="4"/>
+              <w:bottom w:val="single" w:color="8EAADB" w:sz="4"/>
+              <w:right w:val="single" w:color="8EAADB" w:sz="4"/>
+            </w:tcBorders>
+            <w:shd w:fill="FFFFFF" w:color="auto" w:val="clear"/>
+            <w:tcMar>
+              <w:top w:type="dxa" w:w="60"/>
+              <w:left w:type="dxa" w:w="100"/>
+              <w:bottom w:type="dxa" w:w="60"/>
+              <w:right w:type="dxa" w:w="100"/>
+            </w:tcMar>
+          </w:tcPr>
+          <w:p>
+            <w:pPr>
+              <w:jc w:val="left"/>
+            </w:pPr>
+            <w:r>
+              <w:rPr>
+                <w:rFonts w:ascii="Century Gothic" w:cs="Century Gothic" w:eastAsia="Century Gothic" w:hAnsi="Century Gothic"/>
+                <w:b/>
+                <w:bCs/>
+                <w:sz w:val="18"/>
+                <w:szCs w:val="18"/>
+              </w:rPr>
               <w:t xml:space="preserve">customer_orders.IS_SPECIAL_ORDER</w:t>
             </w:r>
           </w:p>
@@ -4364,7 +4465,7 @@
               <w:bottom w:val="single" w:color="8EAADB" w:sz="4"/>
               <w:right w:val="single" w:color="8EAADB" w:sz="4"/>
             </w:tcBorders>
-            <w:shd w:fill="DAE9F7" w:color="auto" w:val="clear"/>
+            <w:shd w:fill="FFFFFF" w:color="auto" w:val="clear"/>
             <w:tcMar>
               <w:top w:type="dxa" w:w="60"/>
               <w:left w:type="dxa" w:w="100"/>
@@ -4397,7 +4498,7 @@
               <w:bottom w:val="single" w:color="8EAADB" w:sz="4"/>
               <w:right w:val="single" w:color="8EAADB" w:sz="4"/>
             </w:tcBorders>
-            <w:shd w:fill="DAE9F7" w:color="auto" w:val="clear"/>
+            <w:shd w:fill="FFFFFF" w:color="auto" w:val="clear"/>
             <w:tcMar>
               <w:top w:type="dxa" w:w="60"/>
               <w:left w:type="dxa" w:w="100"/>

</xml_diff>